<commit_message>
Update PROJECT_BRIEF.docx build status after Session 1 completion
Mark Session 1 as complete, set next session to Session 2 (Shoe Last
Integration), record deviations (Section 8.4 reference, __init__.py
additions), and update file inventory.

https://claude.ai/code/session_01TNEDHPz4nS9G1nYKeGiDkn
</commit_message>
<xml_diff>
--- a/PROJECT_BRIEF.docx
+++ b/PROJECT_BRIEF.docx
@@ -884,13 +884,7 @@
           </w:tcPr>
           <w:p>
             <w:r>
-              <w:rPr>
-                <w:rFonts w:ascii="Arial" w:cs="Arial" w:eastAsia="Arial" w:hAnsi="Arial"/>
-                <w:color w:val="C0392B"/>
-                <w:sz w:val="20"/>
-                <w:szCs w:val="20"/>
-              </w:rPr>
-              <w:t xml:space="preserve">NOT STARTED</w:t>
+              <w:t>SESSION 1 COMPLETE</w:t>
             </w:r>
           </w:p>
         </w:tc>
@@ -946,13 +940,7 @@
           </w:tcPr>
           <w:p>
             <w:r>
-              <w:rPr>
-                <w:rFonts w:ascii="Arial" w:cs="Arial" w:eastAsia="Arial" w:hAnsi="Arial"/>
-                <w:color w:val="4A4A4A"/>
-                <w:sz w:val="20"/>
-                <w:szCs w:val="20"/>
-              </w:rPr>
-              <w:t xml:space="preserve">None -- ready to begin Session 1</w:t>
+              <w:t>Session 1 -- Foundation and Plugin Skeleton (COMPLETE)</w:t>
             </w:r>
           </w:p>
         </w:tc>
@@ -1008,13 +996,7 @@
           </w:tcPr>
           <w:p>
             <w:r>
-              <w:rPr>
-                <w:rFonts w:ascii="Arial" w:cs="Arial" w:eastAsia="Arial" w:hAnsi="Arial"/>
-                <w:color w:val="4A4A4A"/>
-                <w:sz w:val="20"/>
-                <w:szCs w:val="20"/>
-              </w:rPr>
-              <w:t xml:space="preserve">Session 1 -- Foundation and Plugin Skeleton</w:t>
+              <w:t>Session 2 -- Shoe Last Integration</w:t>
             </w:r>
           </w:p>
         </w:tc>
@@ -1070,13 +1052,7 @@
           </w:tcPr>
           <w:p>
             <w:r>
-              <w:rPr>
-                <w:rFonts w:ascii="Arial" w:cs="Arial" w:eastAsia="Arial" w:hAnsi="Arial"/>
-                <w:color w:val="4A4A4A"/>
-                <w:sz w:val="20"/>
-                <w:szCs w:val="20"/>
-              </w:rPr>
-              <w:t xml:space="preserve">Awaiting first session</w:t>
+              <w:t>2026-03-11 (Session 1)</w:t>
             </w:r>
           </w:p>
         </w:tc>
@@ -1132,13 +1108,7 @@
           </w:tcPr>
           <w:p>
             <w:r>
-              <w:rPr>
-                <w:rFonts w:ascii="Arial" w:cs="Arial" w:eastAsia="Arial" w:hAnsi="Arial"/>
-                <w:color w:val="4A4A4A"/>
-                <w:sz w:val="20"/>
-                <w:szCs w:val="20"/>
-              </w:rPr>
-              <w:t xml:space="preserve">None yet</w:t>
+              <w:t>OrthoticToolkit/__plugin__.py, OrthoticToolkit/panel.py, OrthoticToolkit/state.py, OrthoticToolkit/commands/__init__.py, OrthoticToolkit/commands/cmd_resetall.py, OrthoticToolkit/geometry/__init__.py, OrthoticToolkit/OrthoticToolkit.rui, OrthoticToolkit/README_INSTALL.txt, OrthoticToolkit_Session1.rhi</w:t>
             </w:r>
           </w:p>
         </w:tc>
@@ -1194,13 +1164,7 @@
           </w:tcPr>
           <w:p>
             <w:r>
-              <w:rPr>
-                <w:rFonts w:ascii="Arial" w:cs="Arial" w:eastAsia="Arial" w:hAnsi="Arial"/>
-                <w:color w:val="4A4A4A"/>
-                <w:sz w:val="20"/>
-                <w:szCs w:val="20"/>
-              </w:rPr>
-              <w:t xml:space="preserve">Not tested</w:t>
+              <w:t>Awaiting Rhino 8 testing -- .rhi packaged and ready</w:t>
             </w:r>
           </w:p>
         </w:tc>
@@ -1443,15 +1407,7 @@
           </w:tcPr>
           <w:p>
             <w:r>
-              <w:rPr>
-                <w:rFonts w:ascii="Arial" w:cs="Arial" w:eastAsia="Arial" w:hAnsi="Arial"/>
-                <w:i/>
-                <w:iCs/>
-                <w:color w:val="4A4A4A"/>
-                <w:sz w:val="20"/>
-                <w:szCs w:val="20"/>
-              </w:rPr>
-              <w:t xml:space="preserve">Pending</w:t>
+              <w:t>Plugin skeleton: __plugin__.py with GUID registration and panel loading. panel.py with 8-tab OrthoticPanel (Foot Scan, Outline, Arch, Heel Cup, Forefoot, Posting, Thickness, Export) using DynamicLayout, status bar with Active Last / Scan labels and Select Last button. state.py with all plugin state variables and reset_all(). OT_ResetAll command. OrthoticToolkit.rui toolbar. README_INSTALL.txt. Packaged as .rhi.</w:t>
             </w:r>
           </w:p>
         </w:tc>
@@ -1474,15 +1430,7 @@
           </w:tcPr>
           <w:p>
             <w:r>
-              <w:rPr>
-                <w:rFonts w:ascii="Arial" w:cs="Arial" w:eastAsia="Arial" w:hAnsi="Arial"/>
-                <w:i/>
-                <w:iCs/>
-                <w:color w:val="4A4A4A"/>
-                <w:sz w:val="20"/>
-                <w:szCs w:val="20"/>
-              </w:rPr>
-              <w:t xml:space="preserve">Pending</w:t>
+              <w:t>Brief references 'Section 8.4' for state variables but no such numbered section exists in the document. State variables were gathered from all tool specifications across the entire brief instead. commands/ and geometry/ directories include __init__.py package files not explicitly listed in the brief but required for Python imports.</w:t>
             </w:r>
           </w:p>
         </w:tc>
@@ -1505,15 +1453,7 @@
           </w:tcPr>
           <w:p>
             <w:r>
-              <w:rPr>
-                <w:rFonts w:ascii="Arial" w:cs="Arial" w:eastAsia="Arial" w:hAnsi="Arial"/>
-                <w:i/>
-                <w:iCs/>
-                <w:color w:val="4A4A4A"/>
-                <w:sz w:val="20"/>
-                <w:szCs w:val="20"/>
-              </w:rPr>
-              <w:t xml:space="preserve">Pending</w:t>
+              <w:t>Awaiting Rhino 8 testing</w:t>
             </w:r>
           </w:p>
         </w:tc>
@@ -1546,13 +1486,7 @@
         <w:spacing w:before="60" w:after="60"/>
       </w:pPr>
       <w:r>
-        <w:rPr>
-          <w:rFonts w:ascii="Arial" w:cs="Arial" w:eastAsia="Arial" w:hAnsi="Arial"/>
-          <w:color w:val="4A4A4A"/>
-          <w:sz w:val="20"/>
-          <w:szCs w:val="20"/>
-        </w:rPr>
-        <w:t xml:space="preserve">None recorded yet. Claude Code must add any deviations here as they occur, with the session number and reason.</w:t>
+        <w:t>Session 1: The brief references 'Section 8.4' for the list of state variables, but the document has no numbered Section 8.4. All state variables were collected from tool specifications across the entire brief (Sections 3-5). Added __init__.py files to commands/ and geometry/ directories for Python package support (not in brief but required for imports).</w:t>
       </w:r>
     </w:p>
     <w:p>
@@ -1582,13 +1516,23 @@
         <w:spacing w:before="60" w:after="60"/>
       </w:pPr>
       <w:r>
-        <w:rPr>
-          <w:rFonts w:ascii="Arial" w:cs="Arial" w:eastAsia="Arial" w:hAnsi="Arial"/>
-          <w:color w:val="4A4A4A"/>
-          <w:sz w:val="20"/>
-          <w:szCs w:val="20"/>
-        </w:rPr>
-        <w:t xml:space="preserve">None yet. Claude Code must keep this list current after every session.</w:t>
+        <w:t>OrthoticToolkit/__plugin__.py</w:t>
+        <w:br/>
+        <w:t>OrthoticToolkit/panel.py</w:t>
+        <w:br/>
+        <w:t>OrthoticToolkit/state.py</w:t>
+        <w:br/>
+        <w:t>OrthoticToolkit/commands/__init__.py</w:t>
+        <w:br/>
+        <w:t>OrthoticToolkit/commands/cmd_resetall.py</w:t>
+        <w:br/>
+        <w:t>OrthoticToolkit/geometry/__init__.py</w:t>
+        <w:br/>
+        <w:t>OrthoticToolkit/OrthoticToolkit.rui</w:t>
+        <w:br/>
+        <w:t>OrthoticToolkit/README_INSTALL.txt</w:t>
+        <w:br/>
+        <w:t>OrthoticToolkit_Session1.rhi</w:t>
       </w:r>
     </w:p>
     <w:p>

</xml_diff>

<commit_message>
Update PROJECT_BRIEF.docx build status for Session 2 completion
- Overall Status: SESSION 2 COMPLETE
- Next Session: Session 3 -- Foot Scan Import and Plantar Extraction
- Added Session 2 row to completed sessions table
- Updated file list, known deviations, and repository file inventory

https://claude.ai/code/session_01TNEDHPz4nS9G1nYKeGiDkn
</commit_message>
<xml_diff>
--- a/PROJECT_BRIEF.docx
+++ b/PROJECT_BRIEF.docx
@@ -1,6 +1,6 @@
 
 <file path=word/document.xml><?xml version="1.0" encoding="utf-8"?>
-<w:document xmlns:wpc="http://schemas.microsoft.com/office/word/2010/wordprocessingCanvas" xmlns:mc="http://schemas.openxmlformats.org/markup-compatibility/2006" xmlns:o="urn:schemas-microsoft-com:office:office" xmlns:r="http://schemas.openxmlformats.org/officeDocument/2006/relationships" xmlns:m="http://schemas.openxmlformats.org/officeDocument/2006/math" xmlns:v="urn:schemas-microsoft-com:vml" xmlns:wp14="http://schemas.microsoft.com/office/word/2010/wordprocessingDrawing" xmlns:wp="http://schemas.openxmlformats.org/drawingml/2006/wordprocessingDrawing" xmlns:w10="urn:schemas-microsoft-com:office:word" xmlns:w="http://schemas.openxmlformats.org/wordprocessingml/2006/main" xmlns:w14="http://schemas.microsoft.com/office/word/2010/wordml" xmlns:w15="http://schemas.microsoft.com/office/word/2012/wordml" xmlns:wpg="http://schemas.microsoft.com/office/word/2010/wordprocessingGroup" xmlns:wpi="http://schemas.microsoft.com/office/word/2010/wordprocessingInk" xmlns:wne="http://schemas.microsoft.com/office/word/2006/wordml" xmlns:wps="http://schemas.microsoft.com/office/word/2010/wordprocessingShape" xmlns:cx="http://schemas.microsoft.com/office/drawing/2014/chartex" xmlns:cx1="http://schemas.microsoft.com/office/drawing/2015/9/8/chartex" xmlns:cx2="http://schemas.microsoft.com/office/drawing/2015/10/21/chartex" xmlns:cx3="http://schemas.microsoft.com/office/drawing/2016/5/9/chartex" xmlns:cx4="http://schemas.microsoft.com/office/drawing/2016/5/10/chartex" xmlns:cx5="http://schemas.microsoft.com/office/drawing/2016/5/11/chartex" xmlns:cx6="http://schemas.microsoft.com/office/drawing/2016/5/12/chartex" xmlns:cx7="http://schemas.microsoft.com/office/drawing/2016/5/13/chartex" xmlns:cx8="http://schemas.microsoft.com/office/drawing/2016/5/14/chartex" xmlns:aink="http://schemas.microsoft.com/office/drawing/2016/ink" xmlns:am3d="http://schemas.microsoft.com/office/drawing/2017/model3d" xmlns:w16cex="http://schemas.microsoft.com/office/word/2018/wordml/cex" xmlns:w16cid="http://schemas.microsoft.com/office/word/2016/wordml/cid" xmlns:w16="http://schemas.microsoft.com/office/word/2018/wordml" xmlns:w16sdtdh="http://schemas.microsoft.com/office/word/2020/wordml/sdtdatahash" xmlns:w16se="http://schemas.microsoft.com/office/word/2015/wordml/symex" mc:Ignorable="w14 w15 wp14">
+<w:document xmlns:mc="http://schemas.openxmlformats.org/markup-compatibility/2006" xmlns:w="http://schemas.openxmlformats.org/wordprocessingml/2006/main" mc:Ignorable="w14 w15 wp14">
   <w:body>
     <w:p>
       <w:pPr>
@@ -884,7 +884,7 @@
           </w:tcPr>
           <w:p>
             <w:r>
-              <w:t>SESSION 1 COMPLETE</w:t>
+              <w:t xml:space="preserve">SESSION 2 COMPLETE</w:t>
             </w:r>
           </w:p>
         </w:tc>
@@ -940,7 +940,7 @@
           </w:tcPr>
           <w:p>
             <w:r>
-              <w:t>Session 1 -- Foundation and Plugin Skeleton (COMPLETE)</w:t>
+              <w:t xml:space="preserve">Session 2 -- Shoe Last Integration (COMPLETE)</w:t>
             </w:r>
           </w:p>
         </w:tc>
@@ -996,7 +996,7 @@
           </w:tcPr>
           <w:p>
             <w:r>
-              <w:t>Session 2 -- Shoe Last Integration</w:t>
+              <w:t xml:space="preserve">Session 3 -- Foot Scan Import and Plantar Extraction</w:t>
             </w:r>
           </w:p>
         </w:tc>
@@ -1052,7 +1052,7 @@
           </w:tcPr>
           <w:p>
             <w:r>
-              <w:t>2026-03-11 (Session 1)</w:t>
+              <w:t xml:space="preserve">2026-03-11 (Session 2)</w:t>
             </w:r>
           </w:p>
         </w:tc>
@@ -1108,7 +1108,7 @@
           </w:tcPr>
           <w:p>
             <w:r>
-              <w:t>OrthoticToolkit/__plugin__.py, OrthoticToolkit/panel.py, OrthoticToolkit/state.py, OrthoticToolkit/commands/__init__.py, OrthoticToolkit/commands/cmd_resetall.py, OrthoticToolkit/geometry/__init__.py, OrthoticToolkit/OrthoticToolkit.rui, OrthoticToolkit/README_INSTALL.txt, OrthoticToolkit_Session1.rhi</w:t>
+              <w:t xml:space="preserve">OrthoticToolkit/__plugin__.py, OrthoticToolkit/panel.py, OrthoticToolkit/state.py, OrthoticToolkit/commands/__init__.py, OrthoticToolkit/commands/cmd_resetall.py, OrthoticToolkit/commands/cmd_setlast.py, OrthoticToolkit/geometry/__init__.py, OrthoticToolkit/geometry/surface_utils.py, OrthoticToolkit/geometry/mesh_utils.py, OrthoticToolkit/OrthoticToolkit.rui, OrthoticToolkit/README_INSTALL.txt, OrthoticToolkit_Session2.rhi</w:t>
             </w:r>
           </w:p>
         </w:tc>
@@ -1164,7 +1164,7 @@
           </w:tcPr>
           <w:p>
             <w:r>
-              <w:t>Awaiting Rhino 8 testing -- .rhi packaged and ready</w:t>
+              <w:t xml:space="preserve">Awaiting Rhino 8 testing -- .rhi repackaged as Session 2 build</w:t>
             </w:r>
           </w:p>
         </w:tc>
@@ -1203,7 +1203,7 @@
           <w:sz w:val="20"/>
           <w:szCs w:val="20"/>
         </w:rPr>
-        <w:t xml:space="preserve">None yet. This table will be populated as sessions complete.</w:t>
+        <w:t xml:space="preserve">See session rows below.</w:t>
       </w:r>
     </w:p>
     <w:p>
@@ -1458,6 +1458,106 @@
           </w:p>
         </w:tc>
       </w:tr>
+      <w:tr>
+        <w:tc>
+          <w:tcPr>
+            <w:tcW w:type="dxa" w:w="1440"/>
+            <w:tcBorders>
+              <w:top w:val="single" w:color="CCCCCC" w:sz="4"/>
+              <w:left w:val="single" w:color="CCCCCC" w:sz="4"/>
+              <w:bottom w:val="single" w:color="CCCCCC" w:sz="4"/>
+              <w:right w:val="single" w:color="CCCCCC" w:sz="4"/>
+            </w:tcBorders>
+            <w:shd w:fill="F5F5F5" w:val="clear"/>
+            <w:tcMar>
+              <w:top w:type="dxa" w:w="80"/>
+              <w:left w:type="dxa" w:w="160"/>
+              <w:bottom w:type="dxa" w:w="80"/>
+              <w:right w:type="dxa" w:w="160"/>
+            </w:tcMar>
+          </w:tcPr>
+          <w:p>
+            <w:r>
+              <w:rPr>
+                <w:rFonts w:ascii="Arial" w:cs="Arial" w:eastAsia="Arial" w:hAnsi="Arial"/>
+                <w:color w:val="4A4A4A"/>
+                <w:sz w:val="20"/>
+                <w:szCs w:val="20"/>
+              </w:rPr>
+              <w:t xml:space="preserve">2</w:t>
+            </w:r>
+          </w:p>
+        </w:tc>
+        <w:tc>
+          <w:tcPr>
+            <w:tcW w:type="dxa" w:w="2800"/>
+            <w:tcBorders>
+              <w:top w:val="single" w:color="CCCCCC" w:sz="4"/>
+              <w:left w:val="single" w:color="CCCCCC" w:sz="4"/>
+              <w:bottom w:val="single" w:color="CCCCCC" w:sz="4"/>
+              <w:right w:val="single" w:color="CCCCCC" w:sz="4"/>
+            </w:tcBorders>
+            <w:shd w:fill="F5F5F5" w:val="clear"/>
+            <w:tcMar>
+              <w:top w:type="dxa" w:w="80"/>
+              <w:left w:type="dxa" w:w="160"/>
+              <w:bottom w:type="dxa" w:w="80"/>
+              <w:right w:type="dxa" w:w="160"/>
+            </w:tcMar>
+          </w:tcPr>
+          <w:p>
+            <w:r>
+              <w:t xml:space="preserve">Shoe last integration: commands/cmd_setlast.py with OT_SetLast command (Brep selection, sole face detection via face normal dot product with -Z, sole boundary extraction, XY plane projection for footprint curve, inverse sole surface creation with mesh offset fallback, green preview on OT_Preview layer, panel status bar update). geometry/surface_utils.py with create_inverse_sole_surface(), get_surface_bbox(), project_curve_to_plane(), check_gap_tolerance(). geometry/mesh_utils.py with orient_mesh_plantar_down(), get_plantar_boundary(). panel.py updated to wire Select Last button to OT_SetLast with error display. OT_ResetAll enhanced to clean up preview objects. OrthoticToolkit.rui updated with OT_SetLast toolbar button. Repackaged as Session2 .rhi.</w:t>
+            </w:r>
+          </w:p>
+        </w:tc>
+        <w:tc>
+          <w:tcPr>
+            <w:tcW w:type="dxa" w:w="2560"/>
+            <w:tcBorders>
+              <w:top w:val="single" w:color="CCCCCC" w:sz="4"/>
+              <w:left w:val="single" w:color="CCCCCC" w:sz="4"/>
+              <w:bottom w:val="single" w:color="CCCCCC" w:sz="4"/>
+              <w:right w:val="single" w:color="CCCCCC" w:sz="4"/>
+            </w:tcBorders>
+            <w:shd w:fill="F5F5F5" w:val="clear"/>
+            <w:tcMar>
+              <w:top w:type="dxa" w:w="80"/>
+              <w:left w:type="dxa" w:w="160"/>
+              <w:bottom w:type="dxa" w:w="80"/>
+              <w:right w:type="dxa" w:w="160"/>
+            </w:tcMar>
+          </w:tcPr>
+          <w:p>
+            <w:r>
+              <w:t xml:space="preserve">No deviations from the brief. All deliverables implemented as specified. OT_ResetAll was enhanced to delete preview objects from the document before clearing state (logical extension, not in brief).</w:t>
+            </w:r>
+          </w:p>
+        </w:tc>
+        <w:tc>
+          <w:tcPr>
+            <w:tcW w:type="dxa" w:w="2560"/>
+            <w:tcBorders>
+              <w:top w:val="single" w:color="CCCCCC" w:sz="4"/>
+              <w:left w:val="single" w:color="CCCCCC" w:sz="4"/>
+              <w:bottom w:val="single" w:color="CCCCCC" w:sz="4"/>
+              <w:right w:val="single" w:color="CCCCCC" w:sz="4"/>
+            </w:tcBorders>
+            <w:shd w:fill="F5F5F5" w:val="clear"/>
+            <w:tcMar>
+              <w:top w:type="dxa" w:w="80"/>
+              <w:left w:type="dxa" w:w="160"/>
+              <w:bottom w:type="dxa" w:w="80"/>
+              <w:right w:type="dxa" w:w="160"/>
+            </w:tcMar>
+          </w:tcPr>
+          <w:p>
+            <w:r>
+              <w:t xml:space="preserve">Awaiting Rhino 8 testing</w:t>
+            </w:r>
+          </w:p>
+        </w:tc>
+      </w:tr>
     </w:tbl>
     <w:p>
       <w:pPr>
@@ -1486,7 +1586,7 @@
         <w:spacing w:before="60" w:after="60"/>
       </w:pPr>
       <w:r>
-        <w:t>Session 1: The brief references 'Section 8.4' for the list of state variables, but the document has no numbered Section 8.4. All state variables were collected from tool specifications across the entire brief (Sections 3-5). Added __init__.py files to commands/ and geometry/ directories for Python package support (not in brief but required for imports).</w:t>
+        <w:t xml:space="preserve">Session 1: The brief references 'Section 8.4' for the list of state variables, but the document has no numbered Section 8.4. All state variables were collected from tool specifications across the entire brief (Sections 3-5). Added __init__.py files to commands/ and geometry/ directories for Python package support (not in brief but required for imports). Session 2: No deviations from the brief. All deliverables implemented as specified. OT_ResetAll was enhanced to delete preview objects from the document before clearing state (logical extension, not in brief). The .rhi was repackaged as OrthoticToolkit_Session2.rhi replacing the Session 1 archive.</w:t>
       </w:r>
     </w:p>
     <w:p>
@@ -1516,7 +1616,7 @@
         <w:spacing w:before="60" w:after="60"/>
       </w:pPr>
       <w:r>
-        <w:t>OrthoticToolkit/__plugin__.py</w:t>
+        <w:t xml:space="preserve">OrthoticToolkit/__plugin__.py, OrthoticToolkit/panel.py, OrthoticToolkit/state.py, OrthoticToolkit/commands/__init__.py, OrthoticToolkit/commands/cmd_resetall.py, OrthoticToolkit/commands/cmd_setlast.py, OrthoticToolkit/geometry/__init__.py, OrthoticToolkit/geometry/surface_utils.py, OrthoticToolkit/geometry/mesh_utils.py, OrthoticToolkit/OrthoticToolkit.rui, OrthoticToolkit/README_INSTALL.txt, OrthoticToolkit_Session2.rhi</w:t>
         <w:br/>
         <w:t>OrthoticToolkit/panel.py</w:t>
         <w:br/>

</xml_diff>

<commit_message>
Update PROJECT_BRIEF.docx build status for Session 3 completion
- Overall Status: SESSION 3 COMPLETE
- Next Session: Session 4 -- Insole Shape Tools
- Added Session 3 row to completed sessions table
- Updated file list, known deviations, and repository file inventory
- No deviations from brief in Session 3

https://claude.ai/code/session_01TNEDHPz4nS9G1nYKeGiDkn
</commit_message>
<xml_diff>
--- a/PROJECT_BRIEF.docx
+++ b/PROJECT_BRIEF.docx
@@ -884,7 +884,7 @@
           </w:tcPr>
           <w:p>
             <w:r>
-              <w:t xml:space="preserve">SESSION 2 COMPLETE</w:t>
+              <w:t xml:space="preserve">SESSION 3 COMPLETE</w:t>
             </w:r>
           </w:p>
         </w:tc>
@@ -940,7 +940,7 @@
           </w:tcPr>
           <w:p>
             <w:r>
-              <w:t xml:space="preserve">Session 2 -- Shoe Last Integration (COMPLETE)</w:t>
+              <w:t xml:space="preserve">Session 3 -- Foot Scan Import and Plantar Extraction (COMPLETE)</w:t>
             </w:r>
           </w:p>
         </w:tc>
@@ -996,7 +996,7 @@
           </w:tcPr>
           <w:p>
             <w:r>
-              <w:t xml:space="preserve">Session 3 -- Foot Scan Import and Plantar Extraction</w:t>
+              <w:t xml:space="preserve">Session 4 -- Insole Shape Tools</w:t>
             </w:r>
           </w:p>
         </w:tc>
@@ -1052,7 +1052,7 @@
           </w:tcPr>
           <w:p>
             <w:r>
-              <w:t xml:space="preserve">2026-03-11 (Session 2)</w:t>
+              <w:t xml:space="preserve">2026-03-11 (Session 3)</w:t>
             </w:r>
           </w:p>
         </w:tc>
@@ -1108,7 +1108,7 @@
           </w:tcPr>
           <w:p>
             <w:r>
-              <w:t xml:space="preserve">OrthoticToolkit/__plugin__.py, OrthoticToolkit/panel.py, OrthoticToolkit/state.py, OrthoticToolkit/commands/__init__.py, OrthoticToolkit/commands/cmd_resetall.py, OrthoticToolkit/commands/cmd_setlast.py, OrthoticToolkit/geometry/__init__.py, OrthoticToolkit/geometry/surface_utils.py, OrthoticToolkit/geometry/mesh_utils.py, OrthoticToolkit/OrthoticToolkit.rui, OrthoticToolkit/README_INSTALL.txt, OrthoticToolkit_Session2.rhi</w:t>
+              <w:t xml:space="preserve">OrthoticToolkit/__plugin__.py, OrthoticToolkit/panel.py, OrthoticToolkit/state.py, OrthoticToolkit/commands/__init__.py, OrthoticToolkit/commands/cmd_resetall.py, OrthoticToolkit/commands/cmd_setlast.py, OrthoticToolkit/commands/cmd_importscan.py, OrthoticToolkit/commands/cmd_orientscan.py, OrthoticToolkit/commands/cmd_extractplantar.py, OrthoticToolkit/geometry/__init__.py, OrthoticToolkit/geometry/surface_utils.py, OrthoticToolkit/geometry/mesh_utils.py, OrthoticToolkit/OrthoticToolkit.rui, OrthoticToolkit/README_INSTALL.txt, OrthoticToolkit_Session3.rhi</w:t>
             </w:r>
           </w:p>
         </w:tc>
@@ -1164,7 +1164,7 @@
           </w:tcPr>
           <w:p>
             <w:r>
-              <w:t xml:space="preserve">Awaiting Rhino 8 testing -- .rhi repackaged as Session 2 build</w:t>
+              <w:t xml:space="preserve">Awaiting Rhino 8 testing -- .rhi repackaged as Session 3 build</w:t>
             </w:r>
           </w:p>
         </w:tc>
@@ -1558,6 +1558,106 @@
           </w:p>
         </w:tc>
       </w:tr>
+      <w:tr>
+        <w:tc>
+          <w:tcPr>
+            <w:tcW w:type="dxa" w:w="1440"/>
+            <w:tcBorders>
+              <w:top w:val="single" w:color="CCCCCC" w:sz="4"/>
+              <w:left w:val="single" w:color="CCCCCC" w:sz="4"/>
+              <w:bottom w:val="single" w:color="CCCCCC" w:sz="4"/>
+              <w:right w:val="single" w:color="CCCCCC" w:sz="4"/>
+            </w:tcBorders>
+            <w:shd w:fill="F5F5F5" w:val="clear"/>
+            <w:tcMar>
+              <w:top w:type="dxa" w:w="80"/>
+              <w:left w:type="dxa" w:w="160"/>
+              <w:bottom w:type="dxa" w:w="80"/>
+              <w:right w:type="dxa" w:w="160"/>
+            </w:tcMar>
+          </w:tcPr>
+          <w:p>
+            <w:r>
+              <w:rPr>
+                <w:rFonts w:ascii="Arial" w:cs="Arial" w:eastAsia="Arial" w:hAnsi="Arial"/>
+                <w:color w:val="4A4A4A"/>
+                <w:sz w:val="20"/>
+                <w:szCs w:val="20"/>
+              </w:rPr>
+              <w:t xml:space="preserve">3</w:t>
+            </w:r>
+          </w:p>
+        </w:tc>
+        <w:tc>
+          <w:tcPr>
+            <w:tcW w:type="dxa" w:w="2800"/>
+            <w:tcBorders>
+              <w:top w:val="single" w:color="CCCCCC" w:sz="4"/>
+              <w:left w:val="single" w:color="CCCCCC" w:sz="4"/>
+              <w:bottom w:val="single" w:color="CCCCCC" w:sz="4"/>
+              <w:right w:val="single" w:color="CCCCCC" w:sz="4"/>
+            </w:tcBorders>
+            <w:shd w:fill="F5F5F5" w:val="clear"/>
+            <w:tcMar>
+              <w:top w:type="dxa" w:w="80"/>
+              <w:left w:type="dxa" w:w="160"/>
+              <w:bottom w:type="dxa" w:w="80"/>
+              <w:right w:type="dxa" w:w="160"/>
+            </w:tcMar>
+          </w:tcPr>
+          <w:p>
+            <w:r>
+              <w:t xml:space="preserve">Foot scan import and plantar extraction: commands/cmd_importscan.py with OT_ImportScan (Eto file dialog for STL/OBJ/PLY, Rhino _-Import, mesh selection, OT_FootScan layer). commands/cmd_orientscan.py with OT_OrientScan (orient_mesh_plantar_down, rotation reporting). commands/cmd_extractplantar.py with OT_ExtractPlantar (mesh validation, Laplacian smoothing, 40x20 ray-grid +Z intersection, nearest-neighbour gap fill, NurbsSurface.CreateThroughPoints degree 3, low-point warning at &lt;200, OT_PlantarSurface layer). mesh_utils.py updated with apply_laplacian_smoothing() and validate_mesh_for_extraction(). panel.py Foot Scan tab replaced with full controls: Import Scan, orientation dropdown, Auto-Orient, smoothing slider 0-5, Extract Plantar Surface, extraction result label. OrthoticToolkit.rui updated with three new toolbar buttons. Repackaged as Session3 .rhi.</w:t>
+            </w:r>
+          </w:p>
+        </w:tc>
+        <w:tc>
+          <w:tcPr>
+            <w:tcW w:type="dxa" w:w="2560"/>
+            <w:tcBorders>
+              <w:top w:val="single" w:color="CCCCCC" w:sz="4"/>
+              <w:left w:val="single" w:color="CCCCCC" w:sz="4"/>
+              <w:bottom w:val="single" w:color="CCCCCC" w:sz="4"/>
+              <w:right w:val="single" w:color="CCCCCC" w:sz="4"/>
+            </w:tcBorders>
+            <w:shd w:fill="F5F5F5" w:val="clear"/>
+            <w:tcMar>
+              <w:top w:type="dxa" w:w="80"/>
+              <w:left w:type="dxa" w:w="160"/>
+              <w:bottom w:type="dxa" w:w="80"/>
+              <w:right w:type="dxa" w:w="160"/>
+            </w:tcMar>
+          </w:tcPr>
+          <w:p>
+            <w:r>
+              <w:t xml:space="preserve">No deviations from the brief. All deliverables implemented as specified.</w:t>
+            </w:r>
+          </w:p>
+        </w:tc>
+        <w:tc>
+          <w:tcPr>
+            <w:tcW w:type="dxa" w:w="2560"/>
+            <w:tcBorders>
+              <w:top w:val="single" w:color="CCCCCC" w:sz="4"/>
+              <w:left w:val="single" w:color="CCCCCC" w:sz="4"/>
+              <w:bottom w:val="single" w:color="CCCCCC" w:sz="4"/>
+              <w:right w:val="single" w:color="CCCCCC" w:sz="4"/>
+            </w:tcBorders>
+            <w:shd w:fill="F5F5F5" w:val="clear"/>
+            <w:tcMar>
+              <w:top w:type="dxa" w:w="80"/>
+              <w:left w:type="dxa" w:w="160"/>
+              <w:bottom w:type="dxa" w:w="80"/>
+              <w:right w:type="dxa" w:w="160"/>
+            </w:tcMar>
+          </w:tcPr>
+          <w:p>
+            <w:r>
+              <w:t xml:space="preserve">Awaiting Rhino 8 testing</w:t>
+            </w:r>
+          </w:p>
+        </w:tc>
+      </w:tr>
     </w:tbl>
     <w:p>
       <w:pPr>
@@ -1586,7 +1686,7 @@
         <w:spacing w:before="60" w:after="60"/>
       </w:pPr>
       <w:r>
-        <w:t xml:space="preserve">Session 1: The brief references 'Section 8.4' for the list of state variables, but the document has no numbered Section 8.4. All state variables were collected from tool specifications across the entire brief (Sections 3-5). Added __init__.py files to commands/ and geometry/ directories for Python package support (not in brief but required for imports). Session 2: No deviations from the brief. All deliverables implemented as specified. OT_ResetAll was enhanced to delete preview objects from the document before clearing state (logical extension, not in brief). The .rhi was repackaged as OrthoticToolkit_Session2.rhi replacing the Session 1 archive.</w:t>
+        <w:t xml:space="preserve">Session 1: The brief references 'Section 8.4' for the list of state variables, but the document has no numbered Section 8.4. All state variables were collected from tool specifications across the entire brief (Sections 3-5). Added __init__.py files to commands/ and geometry/ directories for Python package support (not in brief but required for imports). Session 2: No deviations. OT_ResetAll enhanced to delete preview objects (logical extension). Session 3: No deviations from the brief. All deliverables implemented as specified.</w:t>
       </w:r>
     </w:p>
     <w:p>
@@ -1616,23 +1716,7 @@
         <w:spacing w:before="60" w:after="60"/>
       </w:pPr>
       <w:r>
-        <w:t xml:space="preserve">OrthoticToolkit/__plugin__.py, OrthoticToolkit/panel.py, OrthoticToolkit/state.py, OrthoticToolkit/commands/__init__.py, OrthoticToolkit/commands/cmd_resetall.py, OrthoticToolkit/commands/cmd_setlast.py, OrthoticToolkit/geometry/__init__.py, OrthoticToolkit/geometry/surface_utils.py, OrthoticToolkit/geometry/mesh_utils.py, OrthoticToolkit/OrthoticToolkit.rui, OrthoticToolkit/README_INSTALL.txt, OrthoticToolkit_Session2.rhi</w:t>
-        <w:br/>
-        <w:t>OrthoticToolkit/panel.py</w:t>
-        <w:br/>
-        <w:t>OrthoticToolkit/state.py</w:t>
-        <w:br/>
-        <w:t>OrthoticToolkit/commands/__init__.py</w:t>
-        <w:br/>
-        <w:t>OrthoticToolkit/commands/cmd_resetall.py</w:t>
-        <w:br/>
-        <w:t>OrthoticToolkit/geometry/__init__.py</w:t>
-        <w:br/>
-        <w:t>OrthoticToolkit/OrthoticToolkit.rui</w:t>
-        <w:br/>
-        <w:t>OrthoticToolkit/README_INSTALL.txt</w:t>
-        <w:br/>
-        <w:t>OrthoticToolkit_Session1.rhi</w:t>
+        <w:t xml:space="preserve">OrthoticToolkit/__plugin__.py, OrthoticToolkit/panel.py, OrthoticToolkit/state.py, OrthoticToolkit/commands/__init__.py, OrthoticToolkit/commands/cmd_resetall.py, OrthoticToolkit/commands/cmd_setlast.py, OrthoticToolkit/commands/cmd_importscan.py, OrthoticToolkit/commands/cmd_orientscan.py, OrthoticToolkit/commands/cmd_extractplantar.py, OrthoticToolkit/geometry/__init__.py, OrthoticToolkit/geometry/surface_utils.py, OrthoticToolkit/geometry/mesh_utils.py, OrthoticToolkit/OrthoticToolkit.rui, OrthoticToolkit/README_INSTALL.txt, OrthoticToolkit_Session3.rhi</w:t>
       </w:r>
     </w:p>
     <w:p>

</xml_diff>

<commit_message>
Update PROJECT_BRIEF.docx build status for Session 5
- Completed Sessions: Sessions 1-5 complete, Session 6 is next
- Known Deviations: added Session 5 notes (extrusion-based layering
  instead of cap_layer(), ray-shoot rocker outline, File3dm for 3DM
  export, centroid-based overhang check)
- Files list: added cmd_thickness.py, cmd_validate.py, cmd_rocker.py,
  cmd_export.py; updated .rhi to Session5

https://claude.ai/code/session_01TNEDHPz4nS9G1nYKeGiDkn
</commit_message>
<xml_diff>
--- a/PROJECT_BRIEF.docx
+++ b/PROJECT_BRIEF.docx
@@ -1197,13 +1197,7 @@
         <spacing before="60" after="60"/>
       </pPr>
       <r>
-        <rPr>
-          <rFonts ascii="Arial" cs="Arial" eastAsia="Arial" hAnsi="Arial"/>
-          <color val="4A4A4A"/>
-          <sz val="20"/>
-          <szCs val="20"/>
-        </rPr>
-        <t xml:space="preserve">See session rows below.</t>
+        <t>Sessions 1 through 5 are complete. Session 6 (Polish, Packaging, and Final .rhi) is next.</t>
       </r>
     </p>
     <p>
@@ -1706,7 +1700,7 @@
         <spacing before="60" after="60"/>
       </pPr>
       <r>
-        <t xml:space="preserve">Session 1: The brief references 'Section 8.4' for the list of state variables, but the document has no numbered Section 8.4. All state variables were collected from tool specifications across the entire brief (Sections 3-5). Added __init__.py files to commands/ and geometry/ directories for Python package support (not in brief but required for imports). Session 2: No deviations. OT_ResetAll enhanced to delete preview objects (logical extension). Session 3: No deviations from the brief. Session 4: Panel slider ranges were chosen to match practical parameter ranges (brief Sections 4.2-4.6 describe parameters but do not specify exact slider min/max, so sensible clinical defaults were used). The arch tool uses a parabolic profile swept along a path with an ellipse fallback rather than a cubic Bezier spine (brief Section 4.3), as the parabolic approach produces more reliable boolean unions. The posting tool creates tilted box wedges via NurbsSurface.CreateFromCorners rather than using make_wedge_solid with shear transforms, for better reliability. brep_utils.make_wedge_solid() is available for future use.</t>
+        <t>Session 1: The brief references 'Section 8.4' for the list of state variables, but the document has no numbered Section 8.4. All state variables were collected from tool specifications across the entire brief (Sections 3-5). Added __init__.py files to commands/ and geometry/ directories for Python package support (not in brief but required for imports). Session 2: No deviations. OT_ResetAll enhanced to delete preview objects (logical extension). Session 3: No deviations from the brief. Session 4: Panel slider ranges were chosen to match practical parameter ranges (brief Sections 4.2-4.6 describe parameters but do not specify exact slider min/max, so sensible clinical defaults were used). The arch tool uses a parabolic profile swept along a path with an ellipse fallback rather than a cubic Bezier spine (brief Section 4.3), as the parabolic approach produces more reliable boolean unions. The posting tool creates tilted box wedges via NurbsSurface.CreateFromCorners rather than using make_wedge_solid with shear transforms, for better reliability. brep_utils.make_wedge_solid() is available for future use. Session 5: The brief Section 5.7 specifies calling brep_utils.cap_layer() to build layer Breps; instead, each layer is built by extruding the insole outline between stacked Z levels and capping with CapPlanarHoles, since cap_layer() was not implemented in brep_utils and extrusion-based layering is more robust. The thickness layers are unioned via safe_boolean_union rather than direct brep splitting. The brief Section 4.8 describes the rocker outline as a tangent-point contact curve; the implementation uses upward ray-shooting along the base plane to find the actual flat contact zone perimeter, with a fallback to projected outline if insufficient contact points are found. Export uses File3dm.Write() for 3DM format rather than sc.doc.Export() (brief Section 5.8), as File3dm provides cleaner isolated export without affecting the current document. Validation overhang check samples face normals at face centroids rather than dense surface sampling, which is sufficient for orthotic geometry.</t>
       </r>
     </p>
     <p>
@@ -1736,7 +1730,7 @@
         <spacing before="60" after="60"/>
       </pPr>
       <r>
-        <t xml:space="preserve">OrthoticToolkit/__plugin__.py, OrthoticToolkit/panel.py, OrthoticToolkit/state.py, OrthoticToolkit/commands/__init__.py, OrthoticToolkit/commands/cmd_resetall.py, OrthoticToolkit/commands/cmd_setlast.py, OrthoticToolkit/commands/cmd_importscan.py, OrthoticToolkit/commands/cmd_orientscan.py, OrthoticToolkit/commands/cmd_extractplantar.py, OrthoticToolkit/commands/cmd_outline.py, OrthoticToolkit/commands/cmd_arch.py, OrthoticToolkit/commands/cmd_heelcup.py, OrthoticToolkit/commands/cmd_metdome.py, OrthoticToolkit/commands/cmd_posting.py, OrthoticToolkit/geometry/__init__.py, OrthoticToolkit/geometry/surface_utils.py, OrthoticToolkit/geometry/mesh_utils.py, OrthoticToolkit/geometry/brep_utils.py, OrthoticToolkit/OrthoticToolkit.rui, OrthoticToolkit/README_INSTALL.txt, OrthoticToolkit_Session4.rhi</t>
+        <t>OrthoticToolkit/__plugin__.py, OrthoticToolkit/panel.py, OrthoticToolkit/state.py, OrthoticToolkit/commands/__init__.py, OrthoticToolkit/commands/cmd_resetall.py, OrthoticToolkit/commands/cmd_setlast.py, OrthoticToolkit/commands/cmd_importscan.py, OrthoticToolkit/commands/cmd_orientscan.py, OrthoticToolkit/commands/cmd_extractplantar.py, OrthoticToolkit/commands/cmd_outline.py, OrthoticToolkit/commands/cmd_arch.py, OrthoticToolkit/commands/cmd_heelcup.py, OrthoticToolkit/commands/cmd_metdome.py, OrthoticToolkit/commands/cmd_posting.py, OrthoticToolkit/commands/cmd_thickness.py, OrthoticToolkit/commands/cmd_validate.py, OrthoticToolkit/commands/cmd_rocker.py, OrthoticToolkit/commands/cmd_export.py, OrthoticToolkit/geometry/__init__.py, OrthoticToolkit/geometry/surface_utils.py, OrthoticToolkit/geometry/mesh_utils.py, OrthoticToolkit/geometry/brep_utils.py, OrthoticToolkit/OrthoticToolkit.rui, OrthoticToolkit/README_INSTALL.txt, OrthoticToolkit_Session5.rhi</t>
       </r>
     </p>
     <p>

</xml_diff>

<commit_message>
Update PROJECT_BRIEF.docx: Mark all 6 sessions complete
- Completed Sessions: updated to reflect all six sessions done
- Known Deviations: added Session 6 notes (tooltip audit, global
  exception handler, layer_utils.py centralization, toolbar verification,
  README/QUICK_REFERENCE creation, final .rhi packaging)
- Files list: added geometry/layer_utils.py, QUICK_REFERENCE.txt,
  OrthoticToolkit_v1.0.rhi; removed Session5 .rhi

https://claude.ai/code/session_01TNEDHPz4nS9G1nYKeGiDkn
</commit_message>
<xml_diff>
--- a/PROJECT_BRIEF.docx
+++ b/PROJECT_BRIEF.docx
@@ -1197,7 +1197,7 @@
         <spacing before="60" after="60"/>
       </pPr>
       <r>
-        <t>Sessions 1 through 5 are complete. Session 6 (Polish, Packaging, and Final .rhi) is next.</t>
+        <t>All six sessions are complete. The plugin is fully built, polished, and packaged as OrthoticToolkit_v1.0.rhi.</t>
       </r>
     </p>
     <p>
@@ -1700,7 +1700,7 @@
         <spacing before="60" after="60"/>
       </pPr>
       <r>
-        <t>Session 1: The brief references 'Section 8.4' for the list of state variables, but the document has no numbered Section 8.4. All state variables were collected from tool specifications across the entire brief (Sections 3-5). Added __init__.py files to commands/ and geometry/ directories for Python package support (not in brief but required for imports). Session 2: No deviations. OT_ResetAll enhanced to delete preview objects (logical extension). Session 3: No deviations from the brief. Session 4: Panel slider ranges were chosen to match practical parameter ranges (brief Sections 4.2-4.6 describe parameters but do not specify exact slider min/max, so sensible clinical defaults were used). The arch tool uses a parabolic profile swept along a path with an ellipse fallback rather than a cubic Bezier spine (brief Section 4.3), as the parabolic approach produces more reliable boolean unions. The posting tool creates tilted box wedges via NurbsSurface.CreateFromCorners rather than using make_wedge_solid with shear transforms, for better reliability. brep_utils.make_wedge_solid() is available for future use. Session 5: The brief Section 5.7 specifies calling brep_utils.cap_layer() to build layer Breps; instead, each layer is built by extruding the insole outline between stacked Z levels and capping with CapPlanarHoles, since cap_layer() was not implemented in brep_utils and extrusion-based layering is more robust. The thickness layers are unioned via safe_boolean_union rather than direct brep splitting. The brief Section 4.8 describes the rocker outline as a tangent-point contact curve; the implementation uses upward ray-shooting along the base plane to find the actual flat contact zone perimeter, with a fallback to projected outline if insufficient contact points are found. Export uses File3dm.Write() for 3DM format rather than sc.doc.Export() (brief Section 5.8), as File3dm provides cleaner isolated export without affecting the current document. Validation overhang check samples face normals at face centroids rather than dense surface sampling, which is sufficient for orthotic geometry.</t>
+        <t>Session 1: The brief references 'Section 8.4' for the list of state variables, but the document has no numbered Section 8.4. All state variables were collected from tool specifications across the entire brief (Sections 3-5). Added __init__.py files to commands/ and geometry/ directories for Python package support (not in brief but required for imports). Session 2: No deviations. OT_ResetAll enhanced to delete preview objects (logical extension). Session 3: No deviations from the brief. Session 4: Panel slider ranges were chosen to match practical parameter ranges (brief Sections 4.2-4.6 describe parameters but do not specify exact slider min/max, so sensible clinical defaults were used). The arch tool uses a parabolic profile swept along a path with an ellipse fallback rather than a cubic Bezier spine (brief Section 4.3), as the parabolic approach produces more reliable boolean unions. The posting tool creates tilted box wedges via NurbsSurface.CreateFromCorners rather than using make_wedge_solid with shear transforms, for better reliability. brep_utils.make_wedge_solid() is available for future use. Session 5: The brief Section 5.7 specifies calling brep_utils.cap_layer() to build layer Breps; instead, each layer is built by extruding the insole outline between stacked Z levels and capping with CapPlanarHoles, since cap_layer() was not implemented in brep_utils and extrusion-based layering is more robust. The thickness layers are unioned via safe_boolean_union rather than direct brep splitting. The brief Section 4.8 describes the rocker outline as a tangent-point contact curve; the implementation uses upward ray-shooting along the base plane to find the actual flat contact zone perimeter, with a fallback to projected outline if insufficient contact points are found. Export uses File3dm.Write() for 3DM format rather than sc.doc.Export() (brief Section 5.8), as File3dm provides cleaner isolated export without affecting the current document. Validation overhang check samples face normals at face centroids rather than dense surface sampling, which is sufficient for orthotic geometry. Session 6: No major deviations. The tooltip audit added clinical context to all panel controls as specified. The global exception handler was added to __plugin__.py using sys.excepthook as specified. Layer management was centralised into geometry/layer_utils.py, replacing 6 duplicate _ensure_layer() definitions across command files. The .rui toolbar was verified to contain all 14 commands in 5 groups with 4 separators. README_INSTALL.txt was rewritten with installation, quick-start workflow, and troubleshooting sections. QUICK_REFERENCE.txt cheat sheet was created with all 14 commands, workflow order, and layer names. Final packaging produced OrthoticToolkit_v1.0.rhi containing 26 files.</t>
       </r>
     </p>
     <p>
@@ -1730,7 +1730,7 @@
         <spacing before="60" after="60"/>
       </pPr>
       <r>
-        <t>OrthoticToolkit/__plugin__.py, OrthoticToolkit/panel.py, OrthoticToolkit/state.py, OrthoticToolkit/commands/__init__.py, OrthoticToolkit/commands/cmd_resetall.py, OrthoticToolkit/commands/cmd_setlast.py, OrthoticToolkit/commands/cmd_importscan.py, OrthoticToolkit/commands/cmd_orientscan.py, OrthoticToolkit/commands/cmd_extractplantar.py, OrthoticToolkit/commands/cmd_outline.py, OrthoticToolkit/commands/cmd_arch.py, OrthoticToolkit/commands/cmd_heelcup.py, OrthoticToolkit/commands/cmd_metdome.py, OrthoticToolkit/commands/cmd_posting.py, OrthoticToolkit/commands/cmd_thickness.py, OrthoticToolkit/commands/cmd_validate.py, OrthoticToolkit/commands/cmd_rocker.py, OrthoticToolkit/commands/cmd_export.py, OrthoticToolkit/geometry/__init__.py, OrthoticToolkit/geometry/surface_utils.py, OrthoticToolkit/geometry/mesh_utils.py, OrthoticToolkit/geometry/brep_utils.py, OrthoticToolkit/OrthoticToolkit.rui, OrthoticToolkit/README_INSTALL.txt, OrthoticToolkit_Session5.rhi</t>
+        <t>OrthoticToolkit/__plugin__.py, OrthoticToolkit/panel.py, OrthoticToolkit/state.py, OrthoticToolkit/commands/__init__.py, OrthoticToolkit/commands/cmd_resetall.py, OrthoticToolkit/commands/cmd_setlast.py, OrthoticToolkit/commands/cmd_importscan.py, OrthoticToolkit/commands/cmd_orientscan.py, OrthoticToolkit/commands/cmd_extractplantar.py, OrthoticToolkit/commands/cmd_outline.py, OrthoticToolkit/commands/cmd_arch.py, OrthoticToolkit/commands/cmd_heelcup.py, OrthoticToolkit/commands/cmd_metdome.py, OrthoticToolkit/commands/cmd_posting.py, OrthoticToolkit/commands/cmd_thickness.py, OrthoticToolkit/commands/cmd_validate.py, OrthoticToolkit/commands/cmd_rocker.py, OrthoticToolkit/commands/cmd_export.py, OrthoticToolkit/geometry/__init__.py, OrthoticToolkit/geometry/surface_utils.py, OrthoticToolkit/geometry/mesh_utils.py, OrthoticToolkit/geometry/brep_utils.py, OrthoticToolkit/geometry/layer_utils.py, OrthoticToolkit/OrthoticToolkit.rui, OrthoticToolkit/README_INSTALL.txt, OrthoticToolkit/QUICK_REFERENCE.txt, OrthoticToolkit_v1.0.rhi</t>
       </r>
     </p>
     <p>

</xml_diff>